<commit_message>
docs: add multi-subnet cross-VLAN DNS resolution guide
</commit_message>
<xml_diff>
--- a/DNS-config.docx
+++ b/DNS-config.docx
@@ -2065,6 +2065,273 @@
         <w:t>With this setting enabled, whenever electricity returns, the computer automatically powers on, boots Ubuntu, starts K3s, and runs the application completely unattended.</w:t>
       </w:r>
     </w:p>
+    <w:p>
+      <w:pPr>
+        <w:keepNext/>
+        <w:spacing w:before="360" w:after="120"/>
+      </w:pPr>
+      <w:r>
+        <w:rPr>
+          <w:rFonts w:ascii="Calibri" w:hAnsi="Calibri"/>
+          <w:b/>
+          <w:i w:val="0"/>
+          <w:color w:val="184C78"/>
+          <w:sz w:val="36"/>
+        </w:rPr>
+        <w:t>8. Multi-Subnet &amp; Cross-VLAN DNS Resolution Guide</w:t>
+      </w:r>
+    </w:p>
+    <w:p>
+      <w:pPr>
+        <w:spacing w:before="0" w:after="120" w:line="276" w:lineRule="auto"/>
+      </w:pPr>
+      <w:r>
+        <w:rPr>
+          <w:rFonts w:ascii="Calibri" w:hAnsi="Calibri"/>
+          <w:b/>
+          <w:i w:val="0"/>
+          <w:color w:val="333333"/>
+          <w:sz w:val="22"/>
+        </w:rPr>
+        <w:t xml:space="preserve">Root Cause: </w:t>
+      </w:r>
+      <w:r>
+        <w:rPr>
+          <w:rFonts w:ascii="Calibri" w:hAnsi="Calibri"/>
+          <w:b w:val="0"/>
+          <w:i w:val="0"/>
+          <w:color w:val="333333"/>
+          <w:sz w:val="22"/>
+        </w:rPr>
+        <w:t>Why ping works but DNS fails across subnets: When you can ping 10.54.23.55 from a different subnet/VLAN, Layer-3 IP routing is working correctly. However, '.local' mDNS (Multicast DNS) uses multicast UDP packets on port 5353. By RFC 6762 standard, multicast packets are restricted to a single Layer-2 broadcast domain (TTL=1) and are dropped by enterprise routers between subnets by default.</w:t>
+      </w:r>
+    </w:p>
+    <w:tbl>
+      <w:tblPr>
+        <w:tblW w:type="auto" w:w="0"/>
+        <w:jc w:val="center"/>
+        <w:tblLayout w:type="fixed"/>
+        <w:tblLook w:firstColumn="1" w:firstRow="1" w:lastColumn="0" w:lastRow="0" w:noHBand="0" w:noVBand="1" w:val="04A0"/>
+      </w:tblPr>
+      <w:tblGrid>
+        <w:gridCol w:w="9360"/>
+      </w:tblGrid>
+      <w:tr>
+        <w:tc>
+          <w:tcPr>
+            <w:tcW w:type="dxa" w:w="9360"/>
+            <w:shd w:fill="FFFBEB"/>
+            <w:tcBorders>
+              <w:top w:val="none"/>
+              <w:left w:val="single" w:sz="24" w:space="0" w:color="B45309"/>
+              <w:bottom w:val="none"/>
+              <w:right w:val="none"/>
+            </w:tcBorders>
+          </w:tcPr>
+          <w:p>
+            <w:pPr>
+              <w:spacing w:before="80" w:after="40"/>
+            </w:pPr>
+            <w:r>
+              <w:rPr>
+                <w:rFonts w:ascii="Calibri" w:hAnsi="Calibri"/>
+                <w:b/>
+                <w:i w:val="0"/>
+                <w:color w:val="9A3412"/>
+                <w:sz w:val="22"/>
+              </w:rPr>
+              <w:t>Diagnosis Summary:</w:t>
+              <w:br/>
+            </w:r>
+            <w:r>
+              <w:rPr>
+                <w:rFonts w:ascii="Calibri" w:hAnsi="Calibri"/>
+                <w:b w:val="0"/>
+                <w:i w:val="0"/>
+                <w:color w:val="333333"/>
+                <w:sz w:val="21"/>
+              </w:rPr>
+              <w:t>• IP Routing: WORKING (Devices on Subnet B can reach 10.54.23.55 directly).</w:t>
+              <w:br/>
+              <w:t>• mDNS Limitation: Multicast packets cannot jump across subnets/VLANs without a router relay.</w:t>
+              <w:br/>
+              <w:t>• Goal: Provide a Unicast DNS name that resolves across ALL subnets in the office.</w:t>
+            </w:r>
+          </w:p>
+        </w:tc>
+      </w:tr>
+    </w:tbl>
+    <w:p>
+      <w:pPr>
+        <w:spacing w:before="0" w:after="80"/>
+      </w:pPr>
+    </w:p>
+    <w:p>
+      <w:pPr>
+        <w:keepNext/>
+        <w:spacing w:before="280" w:after="80"/>
+      </w:pPr>
+      <w:r>
+        <w:rPr>
+          <w:rFonts w:ascii="Calibri" w:hAnsi="Calibri"/>
+          <w:b/>
+          <w:i w:val="0"/>
+          <w:color w:val="3474AC"/>
+          <w:sz w:val="28"/>
+        </w:rPr>
+        <w:t>Solution 1: Corporate Domain A-Record (Recommended - No Router Setup Needed)</w:t>
+      </w:r>
+    </w:p>
+    <w:p>
+      <w:pPr>
+        <w:spacing w:before="0" w:after="120" w:line="276" w:lineRule="auto"/>
+      </w:pPr>
+      <w:r>
+        <w:rPr>
+          <w:rFonts w:ascii="Calibri" w:hAnsi="Calibri"/>
+          <w:b w:val="0"/>
+          <w:i w:val="0"/>
+          <w:color w:val="333333"/>
+          <w:sz w:val="22"/>
+        </w:rPr>
+        <w:t>The fastest, cleanest, and most robust solution across all subnets, Wi-Fi networks, and guest/staff VLANs is to create a DNS A-Record under your organization's domain (e.g. in Cloudflare, AWS Route 53, or GoDaddy):</w:t>
+        <w:br/>
+        <w:br/>
+        <w:t xml:space="preserve">    Record Type: A</w:t>
+        <w:br/>
+        <w:t xml:space="preserve">    Name: crowdvision.tride.live (or dashboard.tride.live)</w:t>
+        <w:br/>
+        <w:t xml:space="preserve">    Value / IP: 10.54.23.55</w:t>
+        <w:br/>
+        <w:t xml:space="preserve">    TTL: Auto / 300</w:t>
+        <w:br/>
+        <w:br/>
+        <w:t>Why this works across ALL subnets:</w:t>
+        <w:br/>
+        <w:t>• Every device on any subnet uses public DNS (Google 8.8.8.8, Cloudflare 1.1.1.1, or office DHCP).</w:t>
+        <w:br/>
+        <w:t>• Public DNS resolves 'crowdvision.tride.live' to private IP 10.54.23.55.</w:t>
+        <w:br/>
+        <w:t>• Because IP routing already works between your subnets, everyone opens http://crowdvision.tride.live/ with ZERO configuration on their PCs or office routers.</w:t>
+      </w:r>
+    </w:p>
+    <w:p>
+      <w:pPr>
+        <w:keepNext/>
+        <w:spacing w:before="280" w:after="80"/>
+      </w:pPr>
+      <w:r>
+        <w:rPr>
+          <w:rFonts w:ascii="Calibri" w:hAnsi="Calibri"/>
+          <w:b/>
+          <w:i w:val="0"/>
+          <w:color w:val="3474AC"/>
+          <w:sz w:val="28"/>
+        </w:rPr>
+        <w:t>Solution 2: Central Office Router / Local DNS Server (Enterprise Standard)</w:t>
+      </w:r>
+    </w:p>
+    <w:p>
+      <w:pPr>
+        <w:spacing w:before="0" w:after="120" w:line="276" w:lineRule="auto"/>
+      </w:pPr>
+      <w:r>
+        <w:rPr>
+          <w:rFonts w:ascii="Calibri" w:hAnsi="Calibri"/>
+          <w:b w:val="0"/>
+          <w:i w:val="0"/>
+          <w:color w:val="333333"/>
+          <w:sz w:val="22"/>
+        </w:rPr>
+        <w:t>If you prefer keeping the name strictly internal without public DNS, ask your office network / IT administrator to add a local DNS record on the central office router (FortiGate, Cisco, pfSense, UniFi, or Windows Server DNS):</w:t>
+        <w:br/>
+        <w:br/>
+        <w:t xml:space="preserve">    Hostname: crowdvision-dashboard (or crowdvision-dashboard.local)</w:t>
+        <w:br/>
+        <w:t xml:space="preserve">    IP Address: 10.54.23.55</w:t>
+        <w:br/>
+        <w:br/>
+        <w:t>Why this works:</w:t>
+        <w:br/>
+        <w:t>The central router handles DNS for all subnets. When any device on any subnet asks for 'crowdvision-dashboard', the router answers with 10.54.23.55 via standard Unicast DNS (UDP port 53).</w:t>
+      </w:r>
+    </w:p>
+    <w:p>
+      <w:pPr>
+        <w:keepNext/>
+        <w:spacing w:before="280" w:after="80"/>
+      </w:pPr>
+      <w:r>
+        <w:rPr>
+          <w:rFonts w:ascii="Calibri" w:hAnsi="Calibri"/>
+          <w:b/>
+          <w:i w:val="0"/>
+          <w:color w:val="3474AC"/>
+          <w:sz w:val="28"/>
+        </w:rPr>
+        <w:t>Solution 3: Enable mDNS Gateway / Reflector on the Office Router</w:t>
+      </w:r>
+    </w:p>
+    <w:p>
+      <w:pPr>
+        <w:spacing w:before="0" w:after="120" w:line="276" w:lineRule="auto"/>
+      </w:pPr>
+      <w:r>
+        <w:rPr>
+          <w:rFonts w:ascii="Calibri" w:hAnsi="Calibri"/>
+          <w:b w:val="0"/>
+          <w:i w:val="0"/>
+          <w:color w:val="333333"/>
+          <w:sz w:val="22"/>
+        </w:rPr>
+        <w:t>If your office uses managed network switches/routers (e.g., Ubiquiti UniFi, Cisco, Aruba, pfSense, or Fortinet), enable 'mDNS Repeater' or 'mDNS Gateway' in the router management interface:</w:t>
+        <w:br/>
+        <w:t>• UniFi: Settings -&gt; Network -&gt; Enable 'Multicast DNS'.</w:t>
+        <w:br/>
+        <w:t>• pfSense / OPNsense: Install and enable 'Avahi / mDNS Repeater' package across interfaces.</w:t>
+        <w:br/>
+        <w:t>• Cisco / Aruba: Enable 'mDNS Gateway / Service Discovery'.</w:t>
+        <w:br/>
+        <w:t>This allows 'crowdvision-dashboard.local' to cross between different Wi-Fi and Ethernet subnets.</w:t>
+      </w:r>
+    </w:p>
+    <w:p>
+      <w:pPr>
+        <w:keepNext/>
+        <w:spacing w:before="280" w:after="80"/>
+      </w:pPr>
+      <w:r>
+        <w:rPr>
+          <w:rFonts w:ascii="Calibri" w:hAnsi="Calibri"/>
+          <w:b/>
+          <w:i w:val="0"/>
+          <w:color w:val="3474AC"/>
+          <w:sz w:val="28"/>
+        </w:rPr>
+        <w:t>Solution 4: Client hosts File (Immediate PC-Specific Fix)</w:t>
+      </w:r>
+    </w:p>
+    <w:p>
+      <w:pPr>
+        <w:spacing w:before="0" w:after="120" w:line="276" w:lineRule="auto"/>
+      </w:pPr>
+      <w:r>
+        <w:rPr>
+          <w:rFonts w:ascii="Calibri" w:hAnsi="Calibri"/>
+          <w:b w:val="0"/>
+          <w:i w:val="0"/>
+          <w:color w:val="333333"/>
+          <w:sz w:val="22"/>
+        </w:rPr>
+        <w:t>For immediate access from any specific computer on another subnet:</w:t>
+        <w:br/>
+        <w:t>Add this line to the computer's hosts file:</w:t>
+        <w:br/>
+        <w:t xml:space="preserve">    10.54.23.55    crowdvision-dashboard</w:t>
+        <w:br/>
+        <w:t>The browser will immediately open http://crowdvision-dashboard/ across subnets.</w:t>
+      </w:r>
+    </w:p>
     <w:sectPr>
       <w:pgSz w:w="12240" w:h="15840"/>
       <w:pgMar w:top="1440" w:right="1440" w:bottom="1440" w:left="1440" w:header="720" w:footer="720" w:gutter="0"/>

</xml_diff>